<commit_message>
adjusted name to timelog
</commit_message>
<xml_diff>
--- a/docs/doc.docx
+++ b/docs/doc.docx
@@ -111,7 +111,7 @@
           </mc:Choice>
           <mc:Fallback>
             <w:pict>
-              <v:rect w14:anchorId="64F586FB" id="Rechteck 6" o:spid="_x0000_s1026" style="position:absolute;margin-left:0;margin-top:-70.85pt;width:31.55pt;height:841.3pt;z-index:251661312;visibility:visible;mso-wrap-style:square;mso-wrap-distance-left:9pt;mso-wrap-distance-top:0;mso-wrap-distance-right:9pt;mso-wrap-distance-bottom:0;mso-position-horizontal:left;mso-position-horizontal-relative:page;mso-position-vertical:absolute;mso-position-vertical-relative:text;v-text-anchor:middle" o:gfxdata="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" fillcolor="#60caf3 [1943]" stroked="f">
+              <v:rect w14:anchorId="3B4BD5D0" id="Rechteck 6" o:spid="_x0000_s1026" style="position:absolute;margin-left:0;margin-top:-70.85pt;width:31.55pt;height:841.3pt;z-index:251661312;visibility:visible;mso-wrap-style:square;mso-wrap-distance-left:9pt;mso-wrap-distance-top:0;mso-wrap-distance-right:9pt;mso-wrap-distance-bottom:0;mso-position-horizontal:left;mso-position-horizontal-relative:page;mso-position-vertical:absolute;mso-position-vertical-relative:text;v-text-anchor:middle" o:gfxdata="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" fillcolor="#60caf3 [1943]" stroked="f">
                 <v:fill color2="#60caf3 [1943]" rotate="t" angle="180" colors="0 #2e7895;.5 #47aed6;1 #56d0ff" focus="100%" type="gradient"/>
                 <w10:wrap anchorx="page"/>
               </v:rect>
@@ -3039,19 +3039,57 @@
     <w:p>
       <w:pPr>
         <w:jc w:val="both"/>
-      </w:pPr>
-      <w:r>
-        <w:t xml:space="preserve">Folgende Funktionen sind nicht erfordern sondern allmählich </w:t>
-      </w:r>
+        <w:rPr>
+          <w:rFonts w:ascii="Calibri" w:hAnsi="Calibri" w:cs="Calibri"/>
+          <w:sz w:val="28"/>
+          <w:szCs w:val="28"/>
+        </w:rPr>
+      </w:pPr>
+      <w:r>
+        <w:rPr>
+          <w:rFonts w:ascii="Calibri" w:hAnsi="Calibri" w:cs="Calibri"/>
+          <w:sz w:val="28"/>
+          <w:szCs w:val="28"/>
+        </w:rPr>
+        <w:t xml:space="preserve">Folgende Funktionen sind nicht </w:t>
+      </w:r>
+      <w:r>
+        <w:rPr>
+          <w:rFonts w:ascii="Calibri" w:hAnsi="Calibri" w:cs="Calibri"/>
+          <w:sz w:val="28"/>
+          <w:szCs w:val="28"/>
+        </w:rPr>
+        <w:t>erfordern,</w:t>
+      </w:r>
+      <w:r>
+        <w:rPr>
+          <w:rFonts w:ascii="Calibri" w:hAnsi="Calibri" w:cs="Calibri"/>
+          <w:sz w:val="28"/>
+          <w:szCs w:val="28"/>
+        </w:rPr>
+        <w:t xml:space="preserve"> sondern allmählich </w:t>
+      </w:r>
+    </w:p>
+    <w:p>
+      <w:pPr>
+        <w:jc w:val="both"/>
+        <w:rPr>
+          <w:rFonts w:ascii="Calibri" w:hAnsi="Calibri" w:cs="Calibri"/>
+          <w:sz w:val="28"/>
+          <w:szCs w:val="28"/>
+        </w:rPr>
+      </w:pPr>
     </w:p>
     <w:p>
       <w:pPr>
         <w:pStyle w:val="Listenabsatz"/>
-        <w:numPr>
-          <w:ilvl w:val="0"/>
-          <w:numId w:val="5"/>
-        </w:numPr>
-        <w:jc w:val="both"/>
+        <w:ind w:left="927"/>
+        <w:jc w:val="both"/>
+        <w:rPr>
+          <w:rFonts w:ascii="Calibri" w:hAnsi="Calibri" w:cs="Calibri"/>
+          <w:sz w:val="28"/>
+          <w:szCs w:val="28"/>
+        </w:rPr>
       </w:pPr>
     </w:p>
     <w:p>
@@ -3762,14 +3800,14 @@
   <w:abstractNum w:abstractNumId="0" w15:restartNumberingAfterBreak="0">
     <w:nsid w:val="04B12072"/>
     <w:multiLevelType w:val="hybridMultilevel"/>
-    <w:tmpl w:val="F3E40B44"/>
+    <w:tmpl w:val="2348F7AE"/>
     <w:lvl w:ilvl="0" w:tplc="0407000F">
       <w:start w:val="1"/>
       <w:numFmt w:val="decimal"/>
       <w:lvlText w:val="%1."/>
       <w:lvlJc w:val="left"/>
       <w:pPr>
-        <w:ind w:left="720" w:hanging="360"/>
+        <w:ind w:left="927" w:hanging="360"/>
       </w:pPr>
     </w:lvl>
     <w:lvl w:ilvl="1" w:tplc="04070019" w:tentative="1">
@@ -3846,6 +3884,92 @@
     </w:lvl>
   </w:abstractNum>
   <w:abstractNum w:abstractNumId="1" w15:restartNumberingAfterBreak="0">
+    <w:nsid w:val="0F8173CE"/>
+    <w:multiLevelType w:val="hybridMultilevel"/>
+    <w:tmpl w:val="10C0DAA2"/>
+    <w:lvl w:ilvl="0" w:tplc="0407000F">
+      <w:start w:val="1"/>
+      <w:numFmt w:val="decimal"/>
+      <w:lvlText w:val="%1."/>
+      <w:lvlJc w:val="left"/>
+      <w:pPr>
+        <w:ind w:left="1647" w:hanging="360"/>
+      </w:pPr>
+    </w:lvl>
+    <w:lvl w:ilvl="1" w:tplc="04070019" w:tentative="1">
+      <w:start w:val="1"/>
+      <w:numFmt w:val="lowerLetter"/>
+      <w:lvlText w:val="%2."/>
+      <w:lvlJc w:val="left"/>
+      <w:pPr>
+        <w:ind w:left="2367" w:hanging="360"/>
+      </w:pPr>
+    </w:lvl>
+    <w:lvl w:ilvl="2" w:tplc="0407001B" w:tentative="1">
+      <w:start w:val="1"/>
+      <w:numFmt w:val="lowerRoman"/>
+      <w:lvlText w:val="%3."/>
+      <w:lvlJc w:val="right"/>
+      <w:pPr>
+        <w:ind w:left="3087" w:hanging="180"/>
+      </w:pPr>
+    </w:lvl>
+    <w:lvl w:ilvl="3" w:tplc="0407000F" w:tentative="1">
+      <w:start w:val="1"/>
+      <w:numFmt w:val="decimal"/>
+      <w:lvlText w:val="%4."/>
+      <w:lvlJc w:val="left"/>
+      <w:pPr>
+        <w:ind w:left="3807" w:hanging="360"/>
+      </w:pPr>
+    </w:lvl>
+    <w:lvl w:ilvl="4" w:tplc="04070019" w:tentative="1">
+      <w:start w:val="1"/>
+      <w:numFmt w:val="lowerLetter"/>
+      <w:lvlText w:val="%5."/>
+      <w:lvlJc w:val="left"/>
+      <w:pPr>
+        <w:ind w:left="4527" w:hanging="360"/>
+      </w:pPr>
+    </w:lvl>
+    <w:lvl w:ilvl="5" w:tplc="0407001B" w:tentative="1">
+      <w:start w:val="1"/>
+      <w:numFmt w:val="lowerRoman"/>
+      <w:lvlText w:val="%6."/>
+      <w:lvlJc w:val="right"/>
+      <w:pPr>
+        <w:ind w:left="5247" w:hanging="180"/>
+      </w:pPr>
+    </w:lvl>
+    <w:lvl w:ilvl="6" w:tplc="0407000F" w:tentative="1">
+      <w:start w:val="1"/>
+      <w:numFmt w:val="decimal"/>
+      <w:lvlText w:val="%7."/>
+      <w:lvlJc w:val="left"/>
+      <w:pPr>
+        <w:ind w:left="5967" w:hanging="360"/>
+      </w:pPr>
+    </w:lvl>
+    <w:lvl w:ilvl="7" w:tplc="04070019" w:tentative="1">
+      <w:start w:val="1"/>
+      <w:numFmt w:val="lowerLetter"/>
+      <w:lvlText w:val="%8."/>
+      <w:lvlJc w:val="left"/>
+      <w:pPr>
+        <w:ind w:left="6687" w:hanging="360"/>
+      </w:pPr>
+    </w:lvl>
+    <w:lvl w:ilvl="8" w:tplc="0407001B" w:tentative="1">
+      <w:start w:val="1"/>
+      <w:numFmt w:val="lowerRoman"/>
+      <w:lvlText w:val="%9."/>
+      <w:lvlJc w:val="right"/>
+      <w:pPr>
+        <w:ind w:left="7407" w:hanging="180"/>
+      </w:pPr>
+    </w:lvl>
+  </w:abstractNum>
+  <w:abstractNum w:abstractNumId="2" w15:restartNumberingAfterBreak="0">
     <w:nsid w:val="3F72400A"/>
     <w:multiLevelType w:val="hybridMultilevel"/>
     <w:tmpl w:val="1D58FDBC"/>
@@ -3931,7 +4055,7 @@
       </w:pPr>
     </w:lvl>
   </w:abstractNum>
-  <w:abstractNum w:abstractNumId="2" w15:restartNumberingAfterBreak="0">
+  <w:abstractNum w:abstractNumId="3" w15:restartNumberingAfterBreak="0">
     <w:nsid w:val="6AF915C7"/>
     <w:multiLevelType w:val="hybridMultilevel"/>
     <w:tmpl w:val="8D2C3800"/>
@@ -4044,7 +4168,7 @@
       </w:rPr>
     </w:lvl>
   </w:abstractNum>
-  <w:abstractNum w:abstractNumId="3" w15:restartNumberingAfterBreak="0">
+  <w:abstractNum w:abstractNumId="4" w15:restartNumberingAfterBreak="0">
     <w:nsid w:val="71C61705"/>
     <w:multiLevelType w:val="hybridMultilevel"/>
     <w:tmpl w:val="7BFE53DA"/>
@@ -4157,7 +4281,93 @@
       </w:rPr>
     </w:lvl>
   </w:abstractNum>
-  <w:abstractNum w:abstractNumId="4" w15:restartNumberingAfterBreak="0">
+  <w:abstractNum w:abstractNumId="5" w15:restartNumberingAfterBreak="0">
+    <w:nsid w:val="73445A50"/>
+    <w:multiLevelType w:val="hybridMultilevel"/>
+    <w:tmpl w:val="2348F7AE"/>
+    <w:lvl w:ilvl="0" w:tplc="FFFFFFFF">
+      <w:start w:val="1"/>
+      <w:numFmt w:val="decimal"/>
+      <w:lvlText w:val="%1."/>
+      <w:lvlJc w:val="left"/>
+      <w:pPr>
+        <w:ind w:left="927" w:hanging="360"/>
+      </w:pPr>
+    </w:lvl>
+    <w:lvl w:ilvl="1" w:tplc="FFFFFFFF" w:tentative="1">
+      <w:start w:val="1"/>
+      <w:numFmt w:val="lowerLetter"/>
+      <w:lvlText w:val="%2."/>
+      <w:lvlJc w:val="left"/>
+      <w:pPr>
+        <w:ind w:left="1440" w:hanging="360"/>
+      </w:pPr>
+    </w:lvl>
+    <w:lvl w:ilvl="2" w:tplc="FFFFFFFF" w:tentative="1">
+      <w:start w:val="1"/>
+      <w:numFmt w:val="lowerRoman"/>
+      <w:lvlText w:val="%3."/>
+      <w:lvlJc w:val="right"/>
+      <w:pPr>
+        <w:ind w:left="2160" w:hanging="180"/>
+      </w:pPr>
+    </w:lvl>
+    <w:lvl w:ilvl="3" w:tplc="FFFFFFFF" w:tentative="1">
+      <w:start w:val="1"/>
+      <w:numFmt w:val="decimal"/>
+      <w:lvlText w:val="%4."/>
+      <w:lvlJc w:val="left"/>
+      <w:pPr>
+        <w:ind w:left="2880" w:hanging="360"/>
+      </w:pPr>
+    </w:lvl>
+    <w:lvl w:ilvl="4" w:tplc="FFFFFFFF" w:tentative="1">
+      <w:start w:val="1"/>
+      <w:numFmt w:val="lowerLetter"/>
+      <w:lvlText w:val="%5."/>
+      <w:lvlJc w:val="left"/>
+      <w:pPr>
+        <w:ind w:left="3600" w:hanging="360"/>
+      </w:pPr>
+    </w:lvl>
+    <w:lvl w:ilvl="5" w:tplc="FFFFFFFF" w:tentative="1">
+      <w:start w:val="1"/>
+      <w:numFmt w:val="lowerRoman"/>
+      <w:lvlText w:val="%6."/>
+      <w:lvlJc w:val="right"/>
+      <w:pPr>
+        <w:ind w:left="4320" w:hanging="180"/>
+      </w:pPr>
+    </w:lvl>
+    <w:lvl w:ilvl="6" w:tplc="FFFFFFFF" w:tentative="1">
+      <w:start w:val="1"/>
+      <w:numFmt w:val="decimal"/>
+      <w:lvlText w:val="%7."/>
+      <w:lvlJc w:val="left"/>
+      <w:pPr>
+        <w:ind w:left="5040" w:hanging="360"/>
+      </w:pPr>
+    </w:lvl>
+    <w:lvl w:ilvl="7" w:tplc="FFFFFFFF" w:tentative="1">
+      <w:start w:val="1"/>
+      <w:numFmt w:val="lowerLetter"/>
+      <w:lvlText w:val="%8."/>
+      <w:lvlJc w:val="left"/>
+      <w:pPr>
+        <w:ind w:left="5760" w:hanging="360"/>
+      </w:pPr>
+    </w:lvl>
+    <w:lvl w:ilvl="8" w:tplc="FFFFFFFF" w:tentative="1">
+      <w:start w:val="1"/>
+      <w:numFmt w:val="lowerRoman"/>
+      <w:lvlText w:val="%9."/>
+      <w:lvlJc w:val="right"/>
+      <w:pPr>
+        <w:ind w:left="6480" w:hanging="180"/>
+      </w:pPr>
+    </w:lvl>
+  </w:abstractNum>
+  <w:abstractNum w:abstractNumId="6" w15:restartNumberingAfterBreak="0">
     <w:nsid w:val="7C1B664B"/>
     <w:multiLevelType w:val="hybridMultilevel"/>
     <w:tmpl w:val="A4F01ED4"/>
@@ -4271,19 +4481,25 @@
     </w:lvl>
   </w:abstractNum>
   <w:num w:numId="1" w16cid:durableId="54397818">
+    <w:abstractNumId w:val="4"/>
+  </w:num>
+  <w:num w:numId="2" w16cid:durableId="783766849">
     <w:abstractNumId w:val="3"/>
   </w:num>
-  <w:num w:numId="2" w16cid:durableId="783766849">
-    <w:abstractNumId w:val="2"/>
-  </w:num>
   <w:num w:numId="3" w16cid:durableId="603532639">
-    <w:abstractNumId w:val="4"/>
+    <w:abstractNumId w:val="6"/>
   </w:num>
   <w:num w:numId="4" w16cid:durableId="627320880">
     <w:abstractNumId w:val="0"/>
   </w:num>
   <w:num w:numId="5" w16cid:durableId="151259634">
+    <w:abstractNumId w:val="2"/>
+  </w:num>
+  <w:num w:numId="6" w16cid:durableId="1939829414">
     <w:abstractNumId w:val="1"/>
+  </w:num>
+  <w:num w:numId="7" w16cid:durableId="2020037445">
+    <w:abstractNumId w:val="5"/>
   </w:num>
 </w:numbering>
 </file>

</xml_diff>

<commit_message>
small adjustments to timelog and docs
</commit_message>
<xml_diff>
--- a/docs/doc.docx
+++ b/docs/doc.docx
@@ -3240,27 +3240,6 @@
     </w:p>
     <w:p>
       <w:pPr>
-        <w:rPr>
-          <w:rFonts w:ascii="Calibri" w:hAnsi="Calibri" w:cs="Calibri"/>
-        </w:rPr>
-      </w:pPr>
-    </w:p>
-    <w:p>
-      <w:pPr>
-        <w:rPr>
-          <w:rFonts w:ascii="Calibri" w:hAnsi="Calibri" w:cs="Calibri"/>
-        </w:rPr>
-      </w:pPr>
-    </w:p>
-    <w:p>
-      <w:pPr>
-        <w:rPr>
-          <w:rFonts w:ascii="Calibri" w:hAnsi="Calibri" w:cs="Calibri"/>
-        </w:rPr>
-      </w:pPr>
-    </w:p>
-    <w:p>
-      <w:pPr>
         <w:pStyle w:val="berschrift1"/>
         <w:jc w:val="both"/>
         <w:rPr>
@@ -3279,12 +3258,14 @@
           <w:bCs/>
           <w:color w:val="000000" w:themeColor="text1"/>
         </w:rPr>
+        <w:lastRenderedPageBreak/>
         <w:t>3. Systemkonzept</w:t>
       </w:r>
       <w:bookmarkEnd w:id="20"/>
       <w:bookmarkEnd w:id="21"/>
     </w:p>
     <w:p/>
+    <w:p/>
     <w:p>
       <w:pPr>
         <w:pStyle w:val="berschrift2"/>
@@ -3311,31 +3292,117 @@
       <w:bookmarkEnd w:id="23"/>
     </w:p>
     <w:p/>
-    <w:p>
-      <w:r>
-        <w:t>Hallo</w:t>
-      </w:r>
-    </w:p>
-    <w:p/>
-    <w:p/>
-    <w:p>
-      <w:pPr>
-        <w:pStyle w:val="berschrift3"/>
-        <w:rPr>
-          <w:rFonts w:ascii="Calibri" w:hAnsi="Calibri" w:cs="Calibri"/>
-          <w:b/>
-          <w:bCs/>
-          <w:color w:val="000000" w:themeColor="text1"/>
-        </w:rPr>
-      </w:pPr>
-      <w:r>
-        <w:rPr>
-          <w:rFonts w:ascii="Calibri" w:hAnsi="Calibri" w:cs="Calibri"/>
-          <w:b/>
-          <w:bCs/>
-          <w:color w:val="000000" w:themeColor="text1"/>
-        </w:rPr>
-        <w:t>3.1.1 Blockschatlbild</w:t>
+    <w:p/>
+    <w:p>
+      <w:r>
+        <w:drawing>
+          <wp:anchor distT="0" distB="0" distL="114300" distR="114300" simplePos="0" relativeHeight="251662336" behindDoc="0" locked="0" layoutInCell="1" allowOverlap="1" wp14:anchorId="6B966180" wp14:editId="46D5B2AE">
+            <wp:simplePos x="0" y="0"/>
+            <wp:positionH relativeFrom="margin">
+              <wp:align>right</wp:align>
+            </wp:positionH>
+            <wp:positionV relativeFrom="page">
+              <wp:posOffset>3107574</wp:posOffset>
+            </wp:positionV>
+            <wp:extent cx="5760720" cy="3703320"/>
+            <wp:effectExtent l="0" t="0" r="0" b="0"/>
+            <wp:wrapNone/>
+            <wp:docPr id="925627597" name="Grafik 1"/>
+            <wp:cNvGraphicFramePr>
+              <a:graphicFrameLocks xmlns:a="http://schemas.openxmlformats.org/drawingml/2006/main" noChangeAspect="1"/>
+            </wp:cNvGraphicFramePr>
+            <a:graphic xmlns:a="http://schemas.openxmlformats.org/drawingml/2006/main">
+              <a:graphicData uri="http://schemas.openxmlformats.org/drawingml/2006/picture">
+                <pic:pic xmlns:pic="http://schemas.openxmlformats.org/drawingml/2006/picture">
+                  <pic:nvPicPr>
+                    <pic:cNvPr id="925627597" name=""/>
+                    <pic:cNvPicPr/>
+                  </pic:nvPicPr>
+                  <pic:blipFill>
+                    <a:blip r:embed="rId8">
+                      <a:extLst>
+                        <a:ext uri="{28A0092B-C50C-407E-A947-70E740481C1C}">
+                          <a14:useLocalDpi xmlns:a14="http://schemas.microsoft.com/office/drawing/2010/main" val="0"/>
+                        </a:ext>
+                      </a:extLst>
+                    </a:blip>
+                    <a:stretch>
+                      <a:fillRect/>
+                    </a:stretch>
+                  </pic:blipFill>
+                  <pic:spPr>
+                    <a:xfrm>
+                      <a:off x="0" y="0"/>
+                      <a:ext cx="5760720" cy="3703320"/>
+                    </a:xfrm>
+                    <a:prstGeom prst="rect">
+                      <a:avLst/>
+                    </a:prstGeom>
+                  </pic:spPr>
+                </pic:pic>
+              </a:graphicData>
+            </a:graphic>
+          </wp:anchor>
+        </w:drawing>
+      </w:r>
+    </w:p>
+    <w:p/>
+    <w:p/>
+    <w:p/>
+    <w:p/>
+    <w:p/>
+    <w:p/>
+    <w:p/>
+    <w:p/>
+    <w:p/>
+    <w:p/>
+    <w:p/>
+    <w:p/>
+    <w:p/>
+    <w:p>
+      <w:pPr>
+        <w:jc w:val="center"/>
+        <w:rPr>
+          <w:rFonts w:ascii="Calibri" w:hAnsi="Calibri" w:cs="Calibri"/>
+          <w:i/>
+          <w:iCs/>
+          <w:sz w:val="20"/>
+          <w:szCs w:val="20"/>
+        </w:rPr>
+      </w:pPr>
+    </w:p>
+    <w:p>
+      <w:pPr>
+        <w:jc w:val="center"/>
+        <w:rPr>
+          <w:rFonts w:ascii="Calibri" w:hAnsi="Calibri" w:cs="Calibri"/>
+          <w:i/>
+          <w:iCs/>
+          <w:sz w:val="20"/>
+          <w:szCs w:val="20"/>
+        </w:rPr>
+      </w:pPr>
+    </w:p>
+    <w:p>
+      <w:pPr>
+        <w:jc w:val="center"/>
+        <w:rPr>
+          <w:rFonts w:ascii="Calibri" w:hAnsi="Calibri" w:cs="Calibri"/>
+          <w:i/>
+          <w:iCs/>
+          <w:sz w:val="20"/>
+          <w:szCs w:val="20"/>
+        </w:rPr>
+      </w:pPr>
+      <w:r>
+        <w:rPr>
+          <w:rFonts w:ascii="Calibri" w:hAnsi="Calibri" w:cs="Calibri"/>
+          <w:i/>
+          <w:iCs/>
+          <w:sz w:val="20"/>
+          <w:szCs w:val="20"/>
+        </w:rPr>
+        <w:t>Abbildung 1. (Einfaches Blockschaltbild – Gesamsystem)</w:t>
       </w:r>
     </w:p>
     <w:p/>
@@ -3382,7 +3449,43 @@
           <w:bCs/>
           <w:color w:val="000000" w:themeColor="text1"/>
         </w:rPr>
-        <w:t>3.2 Hardwarearchitektur</w:t>
+        <w:t>3</w:t>
+      </w:r>
+      <w:r>
+        <w:rPr>
+          <w:rFonts w:ascii="Calibri" w:hAnsi="Calibri" w:cs="Calibri"/>
+          <w:b/>
+          <w:bCs/>
+          <w:color w:val="000000" w:themeColor="text1"/>
+        </w:rPr>
+        <w:t>.</w:t>
+      </w:r>
+      <w:r>
+        <w:rPr>
+          <w:rFonts w:ascii="Calibri" w:hAnsi="Calibri" w:cs="Calibri"/>
+          <w:b/>
+          <w:bCs/>
+          <w:color w:val="000000" w:themeColor="text1"/>
+        </w:rPr>
+        <w:t>2</w:t>
+      </w:r>
+      <w:r>
+        <w:rPr>
+          <w:rFonts w:ascii="Calibri" w:hAnsi="Calibri" w:cs="Calibri"/>
+          <w:b/>
+          <w:bCs/>
+          <w:color w:val="000000" w:themeColor="text1"/>
+        </w:rPr>
+        <w:t xml:space="preserve"> </w:t>
+      </w:r>
+      <w:r>
+        <w:rPr>
+          <w:rFonts w:ascii="Calibri" w:hAnsi="Calibri" w:cs="Calibri"/>
+          <w:b/>
+          <w:bCs/>
+          <w:color w:val="000000" w:themeColor="text1"/>
+        </w:rPr>
+        <w:t>Hardwarearchitektur</w:t>
       </w:r>
       <w:bookmarkEnd w:id="24"/>
       <w:bookmarkEnd w:id="25"/>
@@ -3439,8 +3542,8 @@
     </w:p>
     <w:p/>
     <w:sectPr>
-      <w:headerReference w:type="default" r:id="rId8"/>
-      <w:footerReference w:type="default" r:id="rId9"/>
+      <w:headerReference w:type="default" r:id="rId9"/>
+      <w:footerReference w:type="default" r:id="rId10"/>
       <w:pgSz w:w="11906" w:h="16838"/>
       <w:pgMar w:top="1417" w:right="1417" w:bottom="1134" w:left="1417" w:header="708" w:footer="708" w:gutter="0"/>
       <w:pgNumType w:start="0"/>
@@ -3792,7 +3895,7 @@
         <v:path o:extrusionok="f" gradientshapeok="t" o:connecttype="rect"/>
         <o:lock v:ext="edit" aspectratio="t"/>
       </v:shapetype>
-      <v:shape id="_x0000_i1025" type="#_x0000_t75" style="width:11.15pt;height:11.15pt" o:bullet="t">
+      <v:shape id="_x0000_i1025" type="#_x0000_t75" style="width:11.25pt;height:11.25pt" o:bullet="t">
         <v:imagedata r:id="rId1" o:title="mso9300"/>
       </v:shape>
     </w:pict>

</xml_diff>